<commit_message>
Creación de borrador de Requerimientos
</commit_message>
<xml_diff>
--- a/sunGames_sa_de_cv/Manuales/Manual_aplicación_catálogo_SunGames.docx
+++ b/sunGames_sa_de_cv/Manuales/Manual_aplicación_catálogo_SunGames.docx
@@ -5338,7 +5338,19 @@
               <w:jc w:val="both"/>
             </w:pPr>
             <w:r>
-              <w:t>Se identifica con los dos primeros dígitos.</w:t>
+              <w:t xml:space="preserve">Se identifica con </w:t>
+            </w:r>
+            <w:r>
+              <w:t>el</w:t>
+            </w:r>
+            <w:r>
+              <w:t xml:space="preserve"> </w:t>
+            </w:r>
+            <w:r>
+              <w:t>segundo</w:t>
+            </w:r>
+            <w:r>
+              <w:t xml:space="preserve"> dígito.</w:t>
             </w:r>
           </w:p>
         </w:tc>
@@ -5370,7 +5382,19 @@
               <w:jc w:val="both"/>
             </w:pPr>
             <w:r>
-              <w:t>Se identifica con los tres primeros dígitos.</w:t>
+              <w:t xml:space="preserve">Se identifica con </w:t>
+            </w:r>
+            <w:r>
+              <w:t>los últimos dos</w:t>
+            </w:r>
+            <w:r>
+              <w:t xml:space="preserve"> dígito</w:t>
+            </w:r>
+            <w:r>
+              <w:t>s</w:t>
+            </w:r>
+            <w:r>
+              <w:t>.</w:t>
             </w:r>
           </w:p>
         </w:tc>
@@ -14094,7 +14118,6 @@
       <w:r>
         <w:t xml:space="preserve"> El módulo de inventarios únicamente aplicará en caso de que la empresa incorpore la comercialización de mercancías físicas tangibles (ediciones de coleccionista en soporte físico o </w:t>
       </w:r>
-      <w:proofErr w:type="spellStart"/>
       <w:r>
         <w:rPr>
           <w:i/>
@@ -14102,7 +14125,6 @@
         </w:rPr>
         <w:t>merchandising</w:t>
       </w:r>
-      <w:proofErr w:type="spellEnd"/>
       <w:r>
         <w:t>).</w:t>
       </w:r>
@@ -14174,10 +14196,7 @@
         <w:t xml:space="preserve">Norma: </w:t>
       </w:r>
       <w:r>
-        <w:t>Finanzas determina en cada contrato si SunGames controla la licencia antes de transferirla al comprador (principal) o si Steam vende una licencia que la propia plataforma controla (agente). La presentación bruta con un gasto de comisión solo se usa cuando SunGames es principal; si es agente, se reconoce como ingreso la comisión o remuneración neta a la que tiene derecho</w:t>
-      </w:r>
-      <w:r>
-        <w:t>.</w:t>
+        <w:t>Finanzas determina en cada contrato si SunGames controla la licencia antes de transferirla al comprador (principal) o si Steam vende una licencia que la propia plataforma controla (agente). La presentación bruta con un gasto de comisión solo se usa cuando SunGames es principal; si es agente, se reconoce como ingreso la comisión o remuneración neta a la que tiene derecho.</w:t>
       </w:r>
     </w:p>
     <w:tbl>
@@ -14612,65 +14631,72 @@
     </w:p>
     <w:p>
       <w:pPr>
+        <w:pStyle w:val="Ttulo3"/>
+        <w:spacing w:line="480" w:lineRule="auto"/>
+        <w:ind w:firstLine="709"/>
+        <w:jc w:val="both"/>
+        <w:rPr>
+          <w:i/>
+          <w:iCs/>
+          <w:sz w:val="24"/>
+          <w:szCs w:val="24"/>
+        </w:rPr>
+      </w:pPr>
+      <w:bookmarkStart w:id="26" w:name="_Toc243839171"/>
+      <w:r>
+        <w:rPr>
+          <w:i/>
+          <w:iCs/>
+          <w:sz w:val="24"/>
+          <w:szCs w:val="24"/>
+        </w:rPr>
+        <w:t xml:space="preserve">Política </w:t>
+      </w:r>
+      <w:r>
+        <w:rPr>
+          <w:i/>
+          <w:iCs/>
+          <w:sz w:val="24"/>
+          <w:szCs w:val="24"/>
+        </w:rPr>
+        <w:t>8</w:t>
+      </w:r>
+      <w:r>
+        <w:rPr>
+          <w:i/>
+          <w:iCs/>
+          <w:sz w:val="24"/>
+          <w:szCs w:val="24"/>
+        </w:rPr>
+        <w:t>: Servicios Profesionales contratados a terceros</w:t>
+      </w:r>
+      <w:bookmarkEnd w:id="26"/>
+      <w:r>
+        <w:rPr>
+          <w:i/>
+          <w:iCs/>
+          <w:sz w:val="24"/>
+          <w:szCs w:val="24"/>
+        </w:rPr>
+        <w:t xml:space="preserve"> </w:t>
+      </w:r>
+    </w:p>
+    <w:p>
+      <w:pPr>
         <w:pStyle w:val="NormalWeb"/>
         <w:spacing w:line="360" w:lineRule="auto"/>
         <w:ind w:firstLine="709"/>
         <w:jc w:val="both"/>
       </w:pPr>
       <w:r>
-        <w:t>La Sección 18 de NIIF para las PYMES (edición 2015 y tercera edición emitida en 2025) exige reconocer como gasto el desembolso interno en intangibles, incluidos investigación y desarrollo, salvo que forme parte del costo de otro activo reconocido. Si SunGames informa bajo NIIF para las PYMES, no capitaliza desarrollo interno en 1204 y 1205, aunque mantiene el control del presupuesto por título para fines internos. La tercera edición rige internacionalmente para períodos anuales desde el 1 de enero de 2027 y admite aplicación anticipada; la adopción en la jurisdicción debe confirmarse.</w:t>
-      </w:r>
-    </w:p>
-    <w:p>
-      <w:pPr>
-        <w:pStyle w:val="Ttulo3"/>
-        <w:spacing w:line="480" w:lineRule="auto"/>
-        <w:ind w:firstLine="709"/>
-        <w:jc w:val="both"/>
-        <w:rPr>
-          <w:i/>
-          <w:iCs/>
-          <w:sz w:val="24"/>
-          <w:szCs w:val="24"/>
-        </w:rPr>
-      </w:pPr>
-      <w:bookmarkStart w:id="26" w:name="_Toc243839171"/>
-      <w:r>
-        <w:rPr>
-          <w:i/>
-          <w:iCs/>
-          <w:sz w:val="24"/>
-          <w:szCs w:val="24"/>
-        </w:rPr>
-        <w:t xml:space="preserve">Política </w:t>
-      </w:r>
-      <w:r>
-        <w:rPr>
-          <w:i/>
-          <w:iCs/>
-          <w:sz w:val="24"/>
-          <w:szCs w:val="24"/>
-        </w:rPr>
-        <w:t>8</w:t>
-      </w:r>
-      <w:r>
-        <w:rPr>
-          <w:i/>
-          <w:iCs/>
-          <w:sz w:val="24"/>
-          <w:szCs w:val="24"/>
-        </w:rPr>
-        <w:t>: Servicios Profesionales contratados a terceros</w:t>
-      </w:r>
-      <w:bookmarkEnd w:id="26"/>
-      <w:r>
-        <w:rPr>
-          <w:i/>
-          <w:iCs/>
-          <w:sz w:val="24"/>
-          <w:szCs w:val="24"/>
-        </w:rPr>
-        <w:t xml:space="preserve"> </w:t>
+        <w:rPr>
+          <w:b/>
+          <w:bCs/>
+        </w:rPr>
+        <w:t xml:space="preserve">Norma: </w:t>
+      </w:r>
+      <w:r>
+        <w:t>SunGames contrata a terceros profesionales para voces, música, efectos y otros recursos creativos especializados, por proyecto y por servicio. El efecto sobre el modelo es que ese gasto se registra como costo directo del título y no como planilla, y que cada pago debe acompañarse del documento tributario correspondiente, de la retención que proceda y de un contrato que garantice los derechos sobre lo entregado.</w:t>
       </w:r>
     </w:p>
     <w:p>
@@ -14681,14 +14707,7 @@
         <w:jc w:val="both"/>
       </w:pPr>
       <w:r>
-        <w:rPr>
-          <w:b/>
-          <w:bCs/>
-        </w:rPr>
-        <w:t xml:space="preserve">Norma: </w:t>
-      </w:r>
-      <w:r>
-        <w:t>SunGames contrata a terceros profesionales para voces, música, efectos y otros recursos creativos especializados, por proyecto y por servicio. El efecto sobre el modelo es que ese gasto se registra como costo directo del título y no como planilla, y que cada pago debe acompañarse del documento tributario correspondiente, de la retención que proceda y de un contrato que garantice los derechos sobre lo entregado.</w:t>
+        <w:t xml:space="preserve"> La guía del Ministerio de Hacienda incluye a las personas jurídicas entre quienes deben retener por prestación de servicios, de modo que SunGames S.A. de C.V. actúa como agente de retención. La retención no es un costo adicional: es parte del honorario que SunGames descuenta al proveedor y entera a Hacienda por cuenta de este.</w:t>
       </w:r>
     </w:p>
     <w:p>
@@ -14699,7 +14718,7 @@
         <w:jc w:val="both"/>
       </w:pPr>
       <w:r>
-        <w:t xml:space="preserve"> La guía del Ministerio de Hacienda incluye a las personas jurídicas entre quienes deben retener por prestación de servicios, de modo que SunGames S.A. de C.V. actúa como agente de retención. La retención no es un costo adicional: es parte del honorario que SunGames descuenta al proveedor y entera a Hacienda por cuenta de este.</w:t>
+        <w:t>Cada contrato con un tercero precisa entregables, formatos, número de revisiones, plazos, honorario (bruto o neto), cesión de derechos patrimoniales o licencia amplia, comercial y mundial que cubra Steam, DLC, secuelas y promoción, reconocimiento de autoría, confidencialidad y una cláusula sobre el uso de voces e interpretaciones, incluyendo que no se usen para entrenar sistemas de inteligencia artificial sin autorización expresa.</w:t>
       </w:r>
     </w:p>
     <w:p>
@@ -14710,7 +14729,7 @@
         <w:jc w:val="both"/>
       </w:pPr>
       <w:r>
-        <w:t>Cada contrato con un tercero precisa entregables, formatos, número de revisiones, plazos, honorario (bruto o neto), cesión de derechos patrimoniales o licencia amplia, comercial y mundial que cubra Steam, DLC, secuelas y promoción, reconocimiento de autoría, confidencialidad y una cláusula sobre el uso de voces e interpretaciones, incluyendo que no se usen para entrenar sistemas de inteligencia artificial sin autorización expresa.</w:t>
+        <w:t>En la contabilidad, el costo se acumula por título: se registra en 1204 Videojuegos en desarrollo si se capitaliza, o en 4102 Servicios directos de desarrollo si se lleva a gasto. El saldo debido al proveedor se acredita a 2101 Proveedores y servicios profesionales, la retención de renta a 2104 Retenciones por pagar (ISSS, AFP y renta) hasta su entero a Hacienda, los adelantos se registran en 1108 Anticipos a proveedores y el IVA, si el proveedor lo cobra y se puede aprovechar, en 1106 IVA crédito fiscal. Los honorarios de carácter administrativo (contables o legales) se llevan a 4203 Honorarios profesionales y no a las cuentas de desarrollo. La distinción por proveedor, tipo de servicio y título se controla en el auxiliar y en el módulo de costos por órdenes de trabajo, porque el catálogo no maneja subcuentas.</w:t>
       </w:r>
     </w:p>
     <w:p>
@@ -14721,21 +14740,7 @@
         <w:jc w:val="both"/>
       </w:pPr>
       <w:r>
-        <w:t xml:space="preserve">En la contabilidad, el costo se acumula por título: se registra en 1204 Videojuegos en desarrollo si se capitaliza, o en 4102 Servicios directos de desarrollo si se lleva a gasto. El saldo </w:t>
-      </w:r>
-      <w:r>
         <w:lastRenderedPageBreak/>
-        <w:t>debido al proveedor se acredita a 2101 Proveedores y servicios profesionales, la retención de renta a 2104 Retenciones por pagar (ISSS, AFP y renta) hasta su entero a Hacienda, los adelantos se registran en 1108 Anticipos a proveedores y el IVA, si el proveedor lo cobra y se puede aprovechar, en 1106 IVA crédito fiscal. Los honorarios de carácter administrativo (contables o legales) se llevan a 4203 Honorarios profesionales y no a las cuentas de desarrollo. La distinción por proveedor, tipo de servicio y título se controla en el auxiliar y en el módulo de costos por órdenes de trabajo, porque el catálogo no maneja subcuentas.</w:t>
-      </w:r>
-    </w:p>
-    <w:p>
-      <w:pPr>
-        <w:pStyle w:val="NormalWeb"/>
-        <w:spacing w:line="360" w:lineRule="auto"/>
-        <w:ind w:firstLine="709"/>
-        <w:jc w:val="both"/>
-      </w:pPr>
-      <w:r>
         <w:t>Registro de referencia para un honorario bruto de USD 1,000 a una persona natural, sin IVA y con costo capitalizado:</w:t>
       </w:r>
     </w:p>
@@ -15676,7 +15681,6 @@
         <w:jc w:val="both"/>
       </w:pPr>
       <w:r>
-        <w:lastRenderedPageBreak/>
         <w:t>La cuota se carga a 4207 Depreciación de mobiliario y equipo, entendida como la del mobiliario y del equipo de oficina y de cómputo de uso administrativo, y se acredita a 1203 Depreciación acumulada. Cuando el equipo se usa directamente en la producción de videojuegos, la cuota se carga a 4103 Costos indirectos de desarrollo y se asigna a cada título mediante el costeo por órdenes de trabajo. Los bienes totalmente depreciados que siguen en uso se controlan en las cuentas de orden 6101 y 7101.</w:t>
       </w:r>
     </w:p>
@@ -15688,7 +15692,11 @@
         <w:jc w:val="both"/>
       </w:pPr>
       <w:r>
-        <w:t>Se revisan al cierre de cada año la vida útil, el método y el valor residual, y se evalúa el deterioro cuando existan indicios, conforme a la Sección 17 de las NIIF para las PYMES (propiedades, planta y equipo) o a la NIC 16 si se adoptan las NIIF completas. Para efectos del impuesto sobre la renta, la Ley de Impuesto sobre la Renta regula la depreciación fiscal con porcentajes máximos; esas tasas se confirman en el texto vigente antes de aplicarse, y la cuota fiscal se lleva en un auxiliar separado de la depreciación contable.</w:t>
+        <w:t xml:space="preserve">Se revisan al cierre de cada año la vida útil, el método y el valor residual, y se evalúa el deterioro cuando existan indicios, conforme a la Sección 17 de las NIIF para las PYMES </w:t>
+      </w:r>
+      <w:r>
+        <w:lastRenderedPageBreak/>
+        <w:t>(propiedades, planta y equipo) o a la NIC 16 si se adoptan las NIIF completas. Para efectos del impuesto sobre la renta, la Ley de Impuesto sobre la Renta regula la depreciación fiscal con porcentajes máximos; esas tasas se confirman en el texto vigente antes de aplicarse, y la cuota fiscal se lleva en un auxiliar separado de la depreciación contable.</w:t>
       </w:r>
     </w:p>
     <w:p>
@@ -15846,7 +15854,6 @@
           <w:sz w:val="24"/>
           <w:szCs w:val="24"/>
         </w:rPr>
-        <w:lastRenderedPageBreak/>
         <w:t>ANEXOS</w:t>
       </w:r>
       <w:bookmarkEnd w:id="28"/>
@@ -16164,6 +16171,7 @@
                 <w:szCs w:val="24"/>
                 <w:lang w:eastAsia="es-SV"/>
               </w:rPr>
+              <w:lastRenderedPageBreak/>
               <w:t>Cuenta de orden</w:t>
             </w:r>
           </w:p>
@@ -17185,7 +17193,11 @@
         <w:t>1 Activo.</w:t>
       </w:r>
       <w:r>
-        <w:t xml:space="preserve"> Grupo 11, activo corriente: 1101 Caja general; 1102 Caja chica; 1103 Bancos; 1104 Cuentas por cobrar a plataformas (Steam); 1105 Otras cuentas por cobrar; 1106 IVA crédito fiscal; 1107 Pago a cuenta de impuesto sobre la renta; 1108 Anticipos a proveedores; 1109 Gastos pagados por anticipado. Grupo 12, activo no corriente: 1201 Mobiliario y equipo de oficina; 1202 Equipo de cómputo; 1203 Depreciación acumulada; 1204 Videojuegos en desarrollo; 1205 Videojuegos terminados; 1206 Amortización acumulada de videojuegos; 1207 Licencias de software; 1208 Amortización acumulada de licencias de software.</w:t>
+        <w:t xml:space="preserve"> Grupo 11, activo corriente: 1101 Caja general; 1102 Caja chica; 1103 Bancos; 1104 Cuentas por cobrar a plataformas (Steam); 1105 Otras cuentas por cobrar; 1106 IVA crédito fiscal; 1107 Pago a cuenta de impuesto sobre la renta; 1108 Anticipos a proveedores; 1109 Gastos pagados por anticipado. Grupo 12, activo no corriente: 1201 Mobiliario y equipo de oficina; 1202 Equipo de cómputo; 1203 Depreciación acumulada; 1204 Videojuegos en </w:t>
+      </w:r>
+      <w:r>
+        <w:lastRenderedPageBreak/>
+        <w:t>desarrollo; 1205 Videojuegos terminados; 1206 Amortización acumulada de videojuegos; 1207 Licencias de software; 1208 Amortización acumulada de licencias de software.</w:t>
       </w:r>
     </w:p>
     <w:p>
@@ -17252,7 +17264,6 @@
         <w:rPr>
           <w:rStyle w:val="Textoennegrita"/>
         </w:rPr>
-        <w:lastRenderedPageBreak/>
         <w:t>5 Ingresos.</w:t>
       </w:r>
       <w:r>
@@ -17288,7 +17299,11 @@
         <w:t>7 Cuentas de orden y control acreedoras.</w:t>
       </w:r>
       <w:r>
-        <w:t xml:space="preserve"> 7101 Responsabilidad por activos totalmente depreciados o amortizados en uso; 7102 Responsabilidad por propiedad intelectual registrada; 7103 Responsabilidad por garantías recibidas; 7104 Responsabilidad por documentos y valores en custodia.</w:t>
+        <w:t xml:space="preserve"> 7101 Responsabilidad por activos totalmente depreciados o amortizados en uso; 7102 Responsabilidad por propiedad intelectual registrada; </w:t>
+      </w:r>
+      <w:r>
+        <w:lastRenderedPageBreak/>
+        <w:t>7103 Responsabilidad por garantías recibidas; 7104 Responsabilidad por documentos y valores en custodia.</w:t>
       </w:r>
     </w:p>
     <w:p>
@@ -17423,7 +17438,6 @@
           <w:sz w:val="24"/>
           <w:szCs w:val="24"/>
         </w:rPr>
-        <w:lastRenderedPageBreak/>
         <w:t>BIBLIOGRAFIA</w:t>
       </w:r>
       <w:bookmarkEnd w:id="32"/>
@@ -17683,6 +17697,7 @@
           <w:szCs w:val="24"/>
           <w:lang w:eastAsia="es-SV"/>
         </w:rPr>
+        <w:lastRenderedPageBreak/>
         <w:t xml:space="preserve">Valve Corporation. </w:t>
       </w:r>
       <w:r>

</xml_diff>